<commit_message>
Axios y react-native-paper instalado. Primera prueba en simulador de las librerias
</commit_message>
<xml_diff>
--- a/Explicaciones sobre tecnología.docx
+++ b/Explicaciones sobre tecnología.docx
@@ -342,7 +342,7 @@
           <w:noProof/>
           <w:lang w:eastAsia="es-ES_tradnl"/>
         </w:rPr>
-        <w:pict w14:anchorId="31A30095">
+        <w:pict w14:anchorId="08DCB357">
           <v:rect id="_x0000_i1026" alt="" style="width:425.2pt;height:.05pt;mso-width-percent:0;mso-height-percent:0;mso-width-percent:0;mso-height-percent:0" o:hralign="center" o:hrstd="t" o:hr="t" fillcolor="#a0a0a0" stroked="f"/>
         </w:pict>
       </w:r>
@@ -639,7 +639,7 @@
           <w:noProof/>
           <w:lang w:eastAsia="es-ES_tradnl"/>
         </w:rPr>
-        <w:pict w14:anchorId="19FEE8B2">
+        <w:pict w14:anchorId="7609D7FB">
           <v:rect id="_x0000_i1025" alt="" style="width:425.2pt;height:.05pt;mso-width-percent:0;mso-height-percent:0;mso-width-percent:0;mso-height-percent:0" o:hralign="center" o:hrstd="t" o:hr="t" fillcolor="#a0a0a0" stroked="f"/>
         </w:pict>
       </w:r>
@@ -955,12 +955,7 @@
       </w:r>
     </w:p>
     <w:p/>
-    <w:p>
-      <w:r>
-        <w:lastRenderedPageBreak/>
-        <w:t>CC y números de teléfono: se separa en dos campos de tipo número para que no hay problemas de formato. Se encarga la aplicación de transformar el número de teléfono en dos campos distintos numéricos</w:t>
-      </w:r>
-    </w:p>
+    <w:p/>
     <w:sectPr>
       <w:pgSz w:w="11906" w:h="16838"/>
       <w:pgMar w:top="1417" w:right="1701" w:bottom="1417" w:left="1701" w:header="708" w:footer="708" w:gutter="0"/>

</xml_diff>